<commit_message>
Add student information to Practical 10
</commit_message>
<xml_diff>
--- a/P10/pract-10-awdf-24CS091.docx
+++ b/P10/pract-10-awdf-24CS091.docx
@@ -1563,6 +1563,44 @@
           <w:szCs w:val="24"/>
         </w:rPr>
       </w:pPr>
+    </w:p>
+    <w:p>
+      <w:pPr>
+        <w:pStyle w:val="2"/>
+      </w:pPr>
+      <w:r>
+        <w:t>Student Information</w:t>
+      </w:r>
+    </w:p>
+    <w:p>
+      <w:r>
+        <w:t>Name: Divyata Savaj</w:t>
+      </w:r>
+    </w:p>
+    <w:p>
+      <w:r>
+        <w:t>ID: 24CS091</w:t>
+      </w:r>
+    </w:p>
+    <w:p>
+      <w:r>
+        <w:t>Email: 24cs091@charusat.edu.in</w:t>
+      </w:r>
+    </w:p>
+    <w:p>
+      <w:r>
+        <w:t>Semester: 5th Semester</w:t>
+      </w:r>
+    </w:p>
+    <w:p>
+      <w:r>
+        <w:t>Program: B.Tech</w:t>
+      </w:r>
+    </w:p>
+    <w:p>
+      <w:r>
+        <w:t>Department: CSE-CSPIT</w:t>
+      </w:r>
     </w:p>
     <w:sectPr>
       <w:headerReference r:id="rId7" w:type="first"/>

</xml_diff>

<commit_message>
Regenerate detailed Word report for Practical 10
</commit_message>
<xml_diff>
--- a/P10/pract-10-awdf-24CS091.docx
+++ b/P10/pract-10-awdf-24CS091.docx
@@ -1140,357 +1140,357 @@
               </w:rPr>
               <w:t>===============================================================</w:t>
               <w:br/>
+            </w:r>
+            <w:r>
+              <w:rPr>
+                <w:rFonts w:ascii="Consolas" w:hAnsi="Consolas"/>
+                <w:b w:val="0"/>
+                <w:sz w:val="17"/>
+              </w:rPr>
               <w:t xml:space="preserve">  Practical 10: Asynchronous Event-Driven Architecture Verification</w:t>
               <w:br/>
+            </w:r>
+            <w:r>
+              <w:rPr>
+                <w:rFonts w:ascii="Consolas" w:hAnsi="Consolas"/>
+                <w:b w:val="0"/>
+                <w:sz w:val="17"/>
+              </w:rPr>
               <w:t xml:space="preserve">  Student: Divyata Savaj (24CS091) | Course: ITUE301</w:t>
               <w:br/>
+            </w:r>
+            <w:r>
+              <w:rPr>
+                <w:rFonts w:ascii="Consolas" w:hAnsi="Consolas"/>
+                <w:b w:val="0"/>
+                <w:sz w:val="17"/>
+              </w:rPr>
               <w:t>===============================================================</w:t>
               <w:br/>
-              <w:br/>
+            </w:r>
+            <w:r>
+              <w:rPr>
+                <w:rFonts w:ascii="Consolas" w:hAnsi="Consolas"/>
+                <w:b w:val="0"/>
+                <w:sz w:val="17"/>
+              </w:rPr>
+              <w:br/>
+            </w:r>
+            <w:r>
+              <w:rPr>
+                <w:rFonts w:ascii="Consolas" w:hAnsi="Consolas"/>
+                <w:b w:val="0"/>
+                <w:sz w:val="17"/>
+              </w:rPr>
               <w:t>[MongoDB Atlas] Connected successfully to: cluster0.sa3a4j2.mongodb.net</w:t>
               <w:br/>
+            </w:r>
+            <w:r>
+              <w:rPr>
+                <w:rFonts w:ascii="Consolas" w:hAnsi="Consolas"/>
+                <w:b w:val="0"/>
+                <w:sz w:val="17"/>
+              </w:rPr>
               <w:t>[EventEmitter] Registered listeners: task-created, task-updated, task-deleted, error</w:t>
               <w:br/>
-              <w:br/>
+            </w:r>
+            <w:r>
+              <w:rPr>
+                <w:rFonts w:ascii="Consolas" w:hAnsi="Consolas"/>
+                <w:b w:val="0"/>
+                <w:sz w:val="17"/>
+              </w:rPr>
+              <w:br/>
+            </w:r>
+            <w:r>
+              <w:rPr>
+                <w:rFonts w:ascii="Consolas" w:hAnsi="Consolas"/>
+                <w:b w:val="0"/>
+                <w:sz w:val="17"/>
+              </w:rPr>
               <w:t>--- Step 1 &amp; 2: Testing Non-Blocking Event Emission on POST /tasks ---</w:t>
               <w:br/>
+            </w:r>
+            <w:r>
+              <w:rPr>
+                <w:rFonts w:ascii="Consolas" w:hAnsi="Consolas"/>
+                <w:b w:val="0"/>
+                <w:sz w:val="17"/>
+              </w:rPr>
               <w:t>[PASS] Test 1: POST /tasks returned HTTP 201 in 42ms (API response sent immediately)</w:t>
               <w:br/>
+            </w:r>
+            <w:r>
+              <w:rPr>
+                <w:rFonts w:ascii="Consolas" w:hAnsi="Consolas"/>
+                <w:b w:val="0"/>
+                <w:sz w:val="17"/>
+              </w:rPr>
               <w:t>[ASYNC] Listener Executed: task-created event processed at T+18ms after HTTP response</w:t>
               <w:br/>
+            </w:r>
+            <w:r>
+              <w:rPr>
+                <w:rFonts w:ascii="Consolas" w:hAnsi="Consolas"/>
+                <w:b w:val="0"/>
+                <w:sz w:val="17"/>
+              </w:rPr>
               <w:t>[ASYNC] Notification Logged: Task "Setup Docker Cluster" created for User 24CS091</w:t>
               <w:br/>
-              <w:br/>
+            </w:r>
+            <w:r>
+              <w:rPr>
+                <w:rFonts w:ascii="Consolas" w:hAnsi="Consolas"/>
+                <w:b w:val="0"/>
+                <w:sz w:val="17"/>
+              </w:rPr>
+              <w:br/>
+            </w:r>
+            <w:r>
+              <w:rPr>
+                <w:rFonts w:ascii="Consolas" w:hAnsi="Consolas"/>
+                <w:b w:val="0"/>
+                <w:sz w:val="17"/>
+              </w:rPr>
               <w:t>--- Step 3: Verifying Timing Differential (Synchronous vs. Asynchronous) ---</w:t>
               <w:br/>
+            </w:r>
+            <w:r>
+              <w:rPr>
+                <w:rFonts w:ascii="Consolas" w:hAnsi="Consolas"/>
+                <w:b w:val="0"/>
+                <w:sz w:val="17"/>
+              </w:rPr>
               <w:t>[TIMESTAMP] API Response Dispatched : 2026-10-12T14:15:30.102Z</w:t>
               <w:br/>
+            </w:r>
+            <w:r>
+              <w:rPr>
+                <w:rFonts w:ascii="Consolas" w:hAnsi="Consolas"/>
+                <w:b w:val="0"/>
+                <w:sz w:val="17"/>
+              </w:rPr>
               <w:t>[TIMESTAMP] Event Handler Finished  : 2026-10-12T14:15:30.120Z</w:t>
               <w:br/>
+            </w:r>
+            <w:r>
+              <w:rPr>
+                <w:rFonts w:ascii="Consolas" w:hAnsi="Consolas"/>
+                <w:b w:val="0"/>
+                <w:sz w:val="17"/>
+              </w:rPr>
               <w:t>[PASS] Verified: Event processing did not block or delay HTTP response loop</w:t>
               <w:br/>
-              <w:br/>
+            </w:r>
+            <w:r>
+              <w:rPr>
+                <w:rFonts w:ascii="Consolas" w:hAnsi="Consolas"/>
+                <w:b w:val="0"/>
+                <w:sz w:val="17"/>
+              </w:rPr>
+              <w:br/>
+            </w:r>
+            <w:r>
+              <w:rPr>
+                <w:rFonts w:ascii="Consolas" w:hAnsi="Consolas"/>
+                <w:b w:val="0"/>
+                <w:sz w:val="17"/>
+              </w:rPr>
               <w:t>--- Supplementary Problem 1: Testing task-deleted Domain Event ---</w:t>
               <w:br/>
+            </w:r>
+            <w:r>
+              <w:rPr>
+                <w:rFonts w:ascii="Consolas" w:hAnsi="Consolas"/>
+                <w:b w:val="0"/>
+                <w:sz w:val="17"/>
+              </w:rPr>
               <w:t>[PASS] Test 2: DELETE /tasks/66f81a7b returned HTTP 200 (Task deleted)</w:t>
               <w:br/>
+            </w:r>
+            <w:r>
+              <w:rPr>
+                <w:rFonts w:ascii="Consolas" w:hAnsi="Consolas"/>
+                <w:b w:val="0"/>
+                <w:sz w:val="17"/>
+              </w:rPr>
               <w:t>[ASYNC] Listener Executed: task-deleted event processed asynchronously</w:t>
               <w:br/>
+            </w:r>
+            <w:r>
+              <w:rPr>
+                <w:rFonts w:ascii="Consolas" w:hAnsi="Consolas"/>
+                <w:b w:val="0"/>
+                <w:sz w:val="17"/>
+              </w:rPr>
               <w:t>[ASYNC] Audit Log: Task ID 66f81a7b purged from MongoDB collection</w:t>
               <w:br/>
-              <w:br/>
+            </w:r>
+            <w:r>
+              <w:rPr>
+                <w:rFonts w:ascii="Consolas" w:hAnsi="Consolas"/>
+                <w:b w:val="0"/>
+                <w:sz w:val="17"/>
+              </w:rPr>
+              <w:br/>
+            </w:r>
+            <w:r>
+              <w:rPr>
+                <w:rFonts w:ascii="Consolas" w:hAnsi="Consolas"/>
+                <w:b w:val="0"/>
+                <w:sz w:val="17"/>
+              </w:rPr>
               <w:t>--- Supplementary Problem 2: Error Event Boundary Handling ---</w:t>
               <w:br/>
+            </w:r>
+            <w:r>
+              <w:rPr>
+                <w:rFonts w:ascii="Consolas" w:hAnsi="Consolas"/>
+                <w:b w:val="0"/>
+                <w:sz w:val="17"/>
+              </w:rPr>
               <w:t>[PASS] Test 3: Malformed payload handled safely without process crash</w:t>
               <w:br/>
+            </w:r>
+            <w:r>
+              <w:rPr>
+                <w:rFonts w:ascii="Consolas" w:hAnsi="Consolas"/>
+                <w:b w:val="0"/>
+                <w:sz w:val="17"/>
+              </w:rPr>
               <w:t>[ASYNC] Error Listener Triggered: Caught simulated exception inside task-created handler</w:t>
               <w:br/>
+            </w:r>
+            <w:r>
+              <w:rPr>
+                <w:rFonts w:ascii="Consolas" w:hAnsi="Consolas"/>
+                <w:b w:val="0"/>
+                <w:sz w:val="17"/>
+              </w:rPr>
               <w:t>[PASS] Server Process Status: RUNNING (Process did not crash)</w:t>
               <w:br/>
-              <w:br/>
+            </w:r>
+            <w:r>
+              <w:rPr>
+                <w:rFonts w:ascii="Consolas" w:hAnsi="Consolas"/>
+                <w:b w:val="0"/>
+                <w:sz w:val="17"/>
+              </w:rPr>
+              <w:br/>
+            </w:r>
+            <w:r>
+              <w:rPr>
+                <w:rFonts w:ascii="Consolas" w:hAnsi="Consolas"/>
+                <w:b w:val="0"/>
+                <w:sz w:val="17"/>
+              </w:rPr>
               <w:t>--- Real-Time Push: Server-Sent Events (SSE) Endpoint Verification ---</w:t>
               <w:br/>
+            </w:r>
+            <w:r>
+              <w:rPr>
+                <w:rFonts w:ascii="Consolas" w:hAnsi="Consolas"/>
+                <w:b w:val="0"/>
+                <w:sz w:val="17"/>
+              </w:rPr>
               <w:t>[PASS] Test 4: Connected to GET /events/notifications (Content-Type: text/event-stream)</w:t>
               <w:br/>
+            </w:r>
+            <w:r>
+              <w:rPr>
+                <w:rFonts w:ascii="Consolas" w:hAnsi="Consolas"/>
+                <w:b w:val="0"/>
+                <w:sz w:val="17"/>
+              </w:rPr>
               <w:t>[PASS] Test 5: Received real-time SSE push event: { type: 'TASK_CREATED', id: '66f81a7b' }</w:t>
               <w:br/>
-              <w:br/>
+            </w:r>
+            <w:r>
+              <w:rPr>
+                <w:rFonts w:ascii="Consolas" w:hAnsi="Consolas"/>
+                <w:b w:val="0"/>
+                <w:sz w:val="17"/>
+              </w:rPr>
+              <w:br/>
+            </w:r>
+            <w:r>
+              <w:rPr>
+                <w:rFonts w:ascii="Consolas" w:hAnsi="Consolas"/>
+                <w:b w:val="0"/>
+                <w:sz w:val="17"/>
+              </w:rPr>
               <w:t>===============================================================</w:t>
               <w:br/>
+            </w:r>
+            <w:r>
+              <w:rPr>
+                <w:rFonts w:ascii="Consolas" w:hAnsi="Consolas"/>
+                <w:b w:val="0"/>
+                <w:sz w:val="17"/>
+              </w:rPr>
               <w:t xml:space="preserve">  Asynchronous Latency Benchmark:</w:t>
               <w:br/>
+            </w:r>
+            <w:r>
+              <w:rPr>
+                <w:rFonts w:ascii="Consolas" w:hAnsi="Consolas"/>
+                <w:b w:val="0"/>
+                <w:sz w:val="17"/>
+              </w:rPr>
               <w:t>===============================================================</w:t>
               <w:br/>
+            </w:r>
+            <w:r>
+              <w:rPr>
+                <w:rFonts w:ascii="Consolas" w:hAnsi="Consolas"/>
+                <w:b w:val="0"/>
+                <w:sz w:val="17"/>
+              </w:rPr>
               <w:t>Synchronous Direct Execution Latency: 148.5ms (simulated external webhook)</w:t>
               <w:br/>
+            </w:r>
+            <w:r>
+              <w:rPr>
+                <w:rFonts w:ascii="Consolas" w:hAnsi="Consolas"/>
+                <w:b w:val="0"/>
+                <w:sz w:val="17"/>
+              </w:rPr>
               <w:t>Asynchronous EventEmitter Latency   :  42.1ms (immediate return)</w:t>
               <w:br/>
+            </w:r>
+            <w:r>
+              <w:rPr>
+                <w:rFonts w:ascii="Consolas" w:hAnsi="Consolas"/>
+                <w:b w:val="0"/>
+                <w:sz w:val="17"/>
+              </w:rPr>
               <w:t>Efficiency Improvement              : ~3.5x faster HTTP response time</w:t>
               <w:br/>
+            </w:r>
+            <w:r>
+              <w:rPr>
+                <w:rFonts w:ascii="Consolas" w:hAnsi="Consolas"/>
+                <w:b w:val="0"/>
+                <w:sz w:val="17"/>
+              </w:rPr>
               <w:t>===============================================================</w:t>
               <w:br/>
-              <w:br/>
+            </w:r>
+            <w:r>
+              <w:rPr>
+                <w:rFonts w:ascii="Consolas" w:hAnsi="Consolas"/>
+                <w:b w:val="0"/>
+                <w:sz w:val="17"/>
+              </w:rPr>
+              <w:br/>
+            </w:r>
+            <w:r>
+              <w:rPr>
+                <w:rFonts w:ascii="Consolas" w:hAnsi="Consolas"/>
+                <w:b w:val="0"/>
+                <w:sz w:val="17"/>
+              </w:rPr>
               <w:t>Test Results Summary: 12 / 12 Tests Passed (100%)</w:t>
-            </w:r>
-            <w:r>
-              <w:rPr>
-                <w:rFonts w:ascii="Consolas" w:hAnsi="Consolas"/>
-                <w:b w:val="0"/>
-                <w:sz w:val="17"/>
-              </w:rPr>
-            </w:r>
-            <w:r>
-              <w:rPr>
-                <w:rFonts w:ascii="Consolas" w:hAnsi="Consolas"/>
-                <w:b w:val="0"/>
-                <w:sz w:val="17"/>
-              </w:rPr>
-            </w:r>
-            <w:r>
-              <w:rPr>
-                <w:rFonts w:ascii="Consolas" w:hAnsi="Consolas"/>
-                <w:b w:val="0"/>
-                <w:sz w:val="17"/>
-              </w:rPr>
-            </w:r>
-            <w:r>
-              <w:rPr>
-                <w:rFonts w:ascii="Consolas" w:hAnsi="Consolas"/>
-                <w:b w:val="0"/>
-                <w:sz w:val="17"/>
-              </w:rPr>
-            </w:r>
-            <w:r>
-              <w:rPr>
-                <w:rFonts w:ascii="Consolas" w:hAnsi="Consolas"/>
-                <w:b w:val="0"/>
-                <w:sz w:val="17"/>
-              </w:rPr>
-            </w:r>
-            <w:r>
-              <w:rPr>
-                <w:rFonts w:ascii="Consolas" w:hAnsi="Consolas"/>
-                <w:b w:val="0"/>
-                <w:sz w:val="17"/>
-              </w:rPr>
-            </w:r>
-            <w:r>
-              <w:rPr>
-                <w:rFonts w:ascii="Consolas" w:hAnsi="Consolas"/>
-                <w:b w:val="0"/>
-                <w:sz w:val="17"/>
-              </w:rPr>
-            </w:r>
-            <w:r>
-              <w:rPr>
-                <w:rFonts w:ascii="Consolas" w:hAnsi="Consolas"/>
-                <w:b w:val="0"/>
-                <w:sz w:val="17"/>
-              </w:rPr>
-            </w:r>
-            <w:r>
-              <w:rPr>
-                <w:rFonts w:ascii="Consolas" w:hAnsi="Consolas"/>
-                <w:b w:val="0"/>
-                <w:sz w:val="17"/>
-              </w:rPr>
-            </w:r>
-            <w:r>
-              <w:rPr>
-                <w:rFonts w:ascii="Consolas" w:hAnsi="Consolas"/>
-                <w:b w:val="0"/>
-                <w:sz w:val="17"/>
-              </w:rPr>
-            </w:r>
-            <w:r>
-              <w:rPr>
-                <w:rFonts w:ascii="Consolas" w:hAnsi="Consolas"/>
-                <w:b w:val="0"/>
-                <w:sz w:val="17"/>
-              </w:rPr>
-            </w:r>
-            <w:r>
-              <w:rPr>
-                <w:rFonts w:ascii="Consolas" w:hAnsi="Consolas"/>
-                <w:b w:val="0"/>
-                <w:sz w:val="17"/>
-              </w:rPr>
-            </w:r>
-            <w:r>
-              <w:rPr>
-                <w:rFonts w:ascii="Consolas" w:hAnsi="Consolas"/>
-                <w:b w:val="0"/>
-                <w:sz w:val="17"/>
-              </w:rPr>
-            </w:r>
-            <w:r>
-              <w:rPr>
-                <w:rFonts w:ascii="Consolas" w:hAnsi="Consolas"/>
-                <w:b w:val="0"/>
-                <w:sz w:val="17"/>
-              </w:rPr>
-            </w:r>
-            <w:r>
-              <w:rPr>
-                <w:rFonts w:ascii="Consolas" w:hAnsi="Consolas"/>
-                <w:b w:val="0"/>
-                <w:sz w:val="17"/>
-              </w:rPr>
-            </w:r>
-            <w:r>
-              <w:rPr>
-                <w:rFonts w:ascii="Consolas" w:hAnsi="Consolas"/>
-                <w:b w:val="0"/>
-                <w:sz w:val="17"/>
-              </w:rPr>
-            </w:r>
-            <w:r>
-              <w:rPr>
-                <w:rFonts w:ascii="Consolas" w:hAnsi="Consolas"/>
-                <w:b w:val="0"/>
-                <w:sz w:val="17"/>
-              </w:rPr>
-            </w:r>
-            <w:r>
-              <w:rPr>
-                <w:rFonts w:ascii="Consolas" w:hAnsi="Consolas"/>
-                <w:b w:val="0"/>
-                <w:sz w:val="17"/>
-              </w:rPr>
-            </w:r>
-            <w:r>
-              <w:rPr>
-                <w:rFonts w:ascii="Consolas" w:hAnsi="Consolas"/>
-                <w:b w:val="0"/>
-                <w:sz w:val="17"/>
-              </w:rPr>
-            </w:r>
-            <w:r>
-              <w:rPr>
-                <w:rFonts w:ascii="Consolas" w:hAnsi="Consolas"/>
-                <w:b w:val="0"/>
-                <w:sz w:val="17"/>
-              </w:rPr>
-            </w:r>
-            <w:r>
-              <w:rPr>
-                <w:rFonts w:ascii="Consolas" w:hAnsi="Consolas"/>
-                <w:b w:val="0"/>
-                <w:sz w:val="17"/>
-              </w:rPr>
-            </w:r>
-            <w:r>
-              <w:rPr>
-                <w:rFonts w:ascii="Consolas" w:hAnsi="Consolas"/>
-                <w:b w:val="0"/>
-                <w:sz w:val="17"/>
-              </w:rPr>
-            </w:r>
-            <w:r>
-              <w:rPr>
-                <w:rFonts w:ascii="Consolas" w:hAnsi="Consolas"/>
-                <w:b w:val="0"/>
-                <w:sz w:val="17"/>
-              </w:rPr>
-            </w:r>
-            <w:r>
-              <w:rPr>
-                <w:rFonts w:ascii="Consolas" w:hAnsi="Consolas"/>
-                <w:b w:val="0"/>
-                <w:sz w:val="17"/>
-              </w:rPr>
-            </w:r>
-            <w:r>
-              <w:rPr>
-                <w:rFonts w:ascii="Consolas" w:hAnsi="Consolas"/>
-                <w:b w:val="0"/>
-                <w:sz w:val="17"/>
-              </w:rPr>
-            </w:r>
-            <w:r>
-              <w:rPr>
-                <w:rFonts w:ascii="Consolas" w:hAnsi="Consolas"/>
-                <w:b w:val="0"/>
-                <w:sz w:val="17"/>
-              </w:rPr>
-            </w:r>
-            <w:r>
-              <w:rPr>
-                <w:rFonts w:ascii="Consolas" w:hAnsi="Consolas"/>
-                <w:b w:val="0"/>
-                <w:sz w:val="17"/>
-              </w:rPr>
-            </w:r>
-            <w:r>
-              <w:rPr>
-                <w:rFonts w:ascii="Consolas" w:hAnsi="Consolas"/>
-                <w:b w:val="0"/>
-                <w:sz w:val="17"/>
-              </w:rPr>
-            </w:r>
-            <w:r>
-              <w:rPr>
-                <w:rFonts w:ascii="Consolas" w:hAnsi="Consolas"/>
-                <w:b w:val="0"/>
-                <w:sz w:val="17"/>
-              </w:rPr>
-            </w:r>
-            <w:r>
-              <w:rPr>
-                <w:rFonts w:ascii="Consolas" w:hAnsi="Consolas"/>
-                <w:b w:val="0"/>
-                <w:sz w:val="17"/>
-              </w:rPr>
-            </w:r>
-            <w:r>
-              <w:rPr>
-                <w:rFonts w:ascii="Consolas" w:hAnsi="Consolas"/>
-                <w:b w:val="0"/>
-                <w:sz w:val="17"/>
-              </w:rPr>
-            </w:r>
-            <w:r>
-              <w:rPr>
-                <w:rFonts w:ascii="Consolas" w:hAnsi="Consolas"/>
-                <w:b w:val="0"/>
-                <w:sz w:val="17"/>
-              </w:rPr>
-            </w:r>
-            <w:r>
-              <w:rPr>
-                <w:rFonts w:ascii="Consolas" w:hAnsi="Consolas"/>
-                <w:b w:val="0"/>
-                <w:sz w:val="17"/>
-              </w:rPr>
-            </w:r>
-            <w:r>
-              <w:rPr>
-                <w:rFonts w:ascii="Consolas" w:hAnsi="Consolas"/>
-                <w:b w:val="0"/>
-                <w:sz w:val="17"/>
-              </w:rPr>
-            </w:r>
-            <w:r>
-              <w:rPr>
-                <w:rFonts w:ascii="Consolas" w:hAnsi="Consolas"/>
-                <w:b w:val="0"/>
-                <w:sz w:val="17"/>
-              </w:rPr>
-            </w:r>
-            <w:r>
-              <w:rPr>
-                <w:rFonts w:ascii="Consolas" w:hAnsi="Consolas"/>
-                <w:b w:val="0"/>
-                <w:sz w:val="17"/>
-              </w:rPr>
-            </w:r>
-            <w:r>
-              <w:rPr>
-                <w:rFonts w:ascii="Consolas" w:hAnsi="Consolas"/>
-                <w:b w:val="0"/>
-                <w:sz w:val="17"/>
-              </w:rPr>
-            </w:r>
-            <w:r>
-              <w:rPr>
-                <w:rFonts w:ascii="Consolas" w:hAnsi="Consolas"/>
-                <w:b w:val="0"/>
-                <w:sz w:val="17"/>
-              </w:rPr>
-            </w:r>
-            <w:r>
-              <w:rPr>
-                <w:rFonts w:ascii="Consolas" w:hAnsi="Consolas"/>
-                <w:b w:val="0"/>
-                <w:sz w:val="17"/>
-              </w:rPr>
-            </w:r>
-            <w:r>
-              <w:rPr>
-                <w:rFonts w:ascii="Consolas" w:hAnsi="Consolas"/>
-                <w:b w:val="0"/>
-                <w:sz w:val="17"/>
-              </w:rPr>
             </w:r>
           </w:p>
         </w:tc>
@@ -1569,7 +1569,7 @@
         <w:pStyle w:val="2"/>
       </w:pPr>
       <w:r>
-        <w:t>Student Information</w:t>
+        <w:t>Academic Details</w:t>
       </w:r>
     </w:p>
     <w:p>
@@ -1579,7 +1579,7 @@
     </w:p>
     <w:p>
       <w:r>
-        <w:t>ID: 24CS091</w:t>
+        <w:t>Student ID: 24CS091</w:t>
       </w:r>
     </w:p>
     <w:p>

</xml_diff>